<commit_message>
Formatting and Conditional Formatting
</commit_message>
<xml_diff>
--- a/05_MS_Excel/MS Excel Notes/Excel Topics.docx
+++ b/05_MS_Excel/MS Excel Notes/Excel Topics.docx
@@ -41,6 +41,16 @@
     <w:p>
       <w:r>
         <w:t>Conditional Formatting</w:t>
+      </w:r>
+    </w:p>
+    <w:p>
+      <w:r>
+        <w:t>Basic Formatting</w:t>
+      </w:r>
+    </w:p>
+    <w:p>
+      <w:r>
+        <w:t>Sorting Data</w:t>
       </w:r>
     </w:p>
     <w:p/>

</xml_diff>

<commit_message>
Text Functions in Excel
</commit_message>
<xml_diff>
--- a/05_MS_Excel/MS Excel Notes/Excel Topics.docx
+++ b/05_MS_Excel/MS Excel Notes/Excel Topics.docx
@@ -71,6 +71,16 @@
     <w:p>
       <w:r>
         <w:t>Trimming WhiteSpace</w:t>
+      </w:r>
+    </w:p>
+    <w:p>
+      <w:r>
+        <w:t>Fixing Column Format</w:t>
+      </w:r>
+    </w:p>
+    <w:p>
+      <w:r>
+        <w:t>Text Functions</w:t>
       </w:r>
     </w:p>
     <w:p/>

</xml_diff>

<commit_message>
Date and Time Function
</commit_message>
<xml_diff>
--- a/05_MS_Excel/MS Excel Notes/Excel Topics.docx
+++ b/05_MS_Excel/MS Excel Notes/Excel Topics.docx
@@ -81,6 +81,16 @@
     <w:p>
       <w:r>
         <w:t>Text Functions</w:t>
+      </w:r>
+    </w:p>
+    <w:p>
+      <w:r>
+        <w:t>If,AND,OR Functions</w:t>
+      </w:r>
+    </w:p>
+    <w:p>
+      <w:r>
+        <w:t>Date and Time Function</w:t>
       </w:r>
     </w:p>
     <w:p/>

</xml_diff>

<commit_message>
Countif, Countifs, Sumif, Sumifs
</commit_message>
<xml_diff>
--- a/05_MS_Excel/MS Excel Notes/Excel Topics.docx
+++ b/05_MS_Excel/MS Excel Notes/Excel Topics.docx
@@ -91,6 +91,11 @@
     <w:p>
       <w:r>
         <w:t>Date and Time Function</w:t>
+      </w:r>
+    </w:p>
+    <w:p>
+      <w:r>
+        <w:t>Countif, Countifs, Sumif, Sumifs</w:t>
       </w:r>
     </w:p>
     <w:p/>

</xml_diff>

<commit_message>
Data Mine Tools in MS Excel
</commit_message>
<xml_diff>
--- a/05_MS_Excel/MS Excel Notes/Excel Topics.docx
+++ b/05_MS_Excel/MS Excel Notes/Excel Topics.docx
@@ -11,8 +11,12 @@
       </w:r>
       <w:r>
         <w:br/>
+      </w:r>
+      <w:proofErr w:type="spellStart"/>
+      <w:r>
         <w:t>Flashfill</w:t>
       </w:r>
+      <w:proofErr w:type="spellEnd"/>
     </w:p>
     <w:p>
       <w:r>
@@ -70,8 +74,13 @@
     </w:p>
     <w:p>
       <w:r>
-        <w:t>Trimming WhiteSpace</w:t>
-      </w:r>
+        <w:t xml:space="preserve">Trimming </w:t>
+      </w:r>
+      <w:proofErr w:type="spellStart"/>
+      <w:r>
+        <w:t>WhiteSpace</w:t>
+      </w:r>
+      <w:proofErr w:type="spellEnd"/>
     </w:p>
     <w:p>
       <w:r>
@@ -84,8 +93,18 @@
       </w:r>
     </w:p>
     <w:p>
-      <w:r>
-        <w:t>If,AND,OR Functions</w:t>
+      <w:proofErr w:type="spellStart"/>
+      <w:proofErr w:type="gramStart"/>
+      <w:r>
+        <w:t>If,AND</w:t>
+      </w:r>
+      <w:proofErr w:type="gramEnd"/>
+      <w:r>
+        <w:t>,OR</w:t>
+      </w:r>
+      <w:proofErr w:type="spellEnd"/>
+      <w:r>
+        <w:t xml:space="preserve"> Functions</w:t>
       </w:r>
     </w:p>
     <w:p>
@@ -94,9 +113,35 @@
       </w:r>
     </w:p>
     <w:p>
-      <w:r>
-        <w:t>Countif, Countifs, Sumif, Sumifs</w:t>
-      </w:r>
+      <w:proofErr w:type="spellStart"/>
+      <w:r>
+        <w:t>Countif</w:t>
+      </w:r>
+      <w:proofErr w:type="spellEnd"/>
+      <w:r>
+        <w:t xml:space="preserve">, </w:t>
+      </w:r>
+      <w:proofErr w:type="spellStart"/>
+      <w:r>
+        <w:t>Countifs</w:t>
+      </w:r>
+      <w:proofErr w:type="spellEnd"/>
+      <w:r>
+        <w:t xml:space="preserve">, </w:t>
+      </w:r>
+      <w:proofErr w:type="spellStart"/>
+      <w:r>
+        <w:t>Sumif</w:t>
+      </w:r>
+      <w:proofErr w:type="spellEnd"/>
+      <w:r>
+        <w:t xml:space="preserve">, </w:t>
+      </w:r>
+      <w:proofErr w:type="spellStart"/>
+      <w:r>
+        <w:t>Sumifs</w:t>
+      </w:r>
+      <w:proofErr w:type="spellEnd"/>
     </w:p>
     <w:p>
       <w:r>
@@ -117,8 +162,15 @@
       <w:r>
         <w:t>Number Tools</w:t>
       </w:r>
-    </w:p>
-    <w:p/>
+      <w:r>
+        <w:t xml:space="preserve"> in Power Query</w:t>
+      </w:r>
+    </w:p>
+    <w:p>
+      <w:r>
+        <w:t>Data Mine Tools in MS Excel</w:t>
+      </w:r>
+    </w:p>
     <w:sectPr>
       <w:pgSz w:w="11906" w:h="16838"/>
       <w:pgMar w:top="1440" w:right="1440" w:bottom="1440" w:left="1440" w:header="708" w:footer="708" w:gutter="0"/>

</xml_diff>

<commit_message>
Power Pivot in Excel
</commit_message>
<xml_diff>
--- a/05_MS_Excel/MS Excel Notes/Excel Topics.docx
+++ b/05_MS_Excel/MS Excel Notes/Excel Topics.docx
@@ -11,12 +11,8 @@
       </w:r>
       <w:r>
         <w:br/>
-      </w:r>
-      <w:proofErr w:type="spellStart"/>
-      <w:r>
         <w:t>Flashfill</w:t>
       </w:r>
-      <w:proofErr w:type="spellEnd"/>
     </w:p>
     <w:p>
       <w:r>
@@ -74,13 +70,8 @@
     </w:p>
     <w:p>
       <w:r>
-        <w:t xml:space="preserve">Trimming </w:t>
-      </w:r>
-      <w:proofErr w:type="spellStart"/>
-      <w:r>
-        <w:t>WhiteSpace</w:t>
-      </w:r>
-      <w:proofErr w:type="spellEnd"/>
+        <w:t>Trimming WhiteSpace</w:t>
+      </w:r>
     </w:p>
     <w:p>
       <w:r>
@@ -93,13 +84,8 @@
       </w:r>
     </w:p>
     <w:p>
-      <w:proofErr w:type="spellStart"/>
-      <w:r>
-        <w:t>If,AND,OR</w:t>
-      </w:r>
-      <w:proofErr w:type="spellEnd"/>
-      <w:r>
-        <w:t xml:space="preserve"> Functions</w:t>
+      <w:r>
+        <w:t>If,AND,OR Functions</w:t>
       </w:r>
     </w:p>
     <w:p>
@@ -108,35 +94,9 @@
       </w:r>
     </w:p>
     <w:p>
-      <w:proofErr w:type="spellStart"/>
-      <w:r>
-        <w:t>Countif</w:t>
-      </w:r>
-      <w:proofErr w:type="spellEnd"/>
-      <w:r>
-        <w:t xml:space="preserve">, </w:t>
-      </w:r>
-      <w:proofErr w:type="spellStart"/>
-      <w:r>
-        <w:t>Countifs</w:t>
-      </w:r>
-      <w:proofErr w:type="spellEnd"/>
-      <w:r>
-        <w:t xml:space="preserve">, </w:t>
-      </w:r>
-      <w:proofErr w:type="spellStart"/>
-      <w:r>
-        <w:t>Sumif</w:t>
-      </w:r>
-      <w:proofErr w:type="spellEnd"/>
-      <w:r>
-        <w:t xml:space="preserve">, </w:t>
-      </w:r>
-      <w:proofErr w:type="spellStart"/>
-      <w:r>
-        <w:t>Sumifs</w:t>
-      </w:r>
-      <w:proofErr w:type="spellEnd"/>
+      <w:r>
+        <w:t>Countif, Countifs, Sumif, Sumifs</w:t>
+      </w:r>
     </w:p>
     <w:p>
       <w:r>
@@ -178,13 +138,13 @@
     </w:p>
     <w:p>
       <w:r>
-        <w:t xml:space="preserve">Data </w:t>
-      </w:r>
-      <w:proofErr w:type="spellStart"/>
-      <w:r>
-        <w:t>Modeling</w:t>
-      </w:r>
-      <w:proofErr w:type="spellEnd"/>
+        <w:t>Data Modeling</w:t>
+      </w:r>
+    </w:p>
+    <w:p>
+      <w:r>
+        <w:t>Import Data in Power Pivot</w:t>
+      </w:r>
     </w:p>
     <w:sectPr>
       <w:pgSz w:w="11906" w:h="16838"/>

</xml_diff>

<commit_message>
Cardinality and Filter Direction
</commit_message>
<xml_diff>
--- a/05_MS_Excel/MS Excel Notes/Excel Topics.docx
+++ b/05_MS_Excel/MS Excel Notes/Excel Topics.docx
@@ -144,6 +144,11 @@
     <w:p>
       <w:r>
         <w:t>Import Data in Power Pivot</w:t>
+      </w:r>
+    </w:p>
+    <w:p>
+      <w:r>
+        <w:t>Cardinality and Filter Direction</w:t>
       </w:r>
     </w:p>
     <w:sectPr>

</xml_diff>

<commit_message>
Pivot Tables and Charts
</commit_message>
<xml_diff>
--- a/05_MS_Excel/MS Excel Notes/Excel Topics.docx
+++ b/05_MS_Excel/MS Excel Notes/Excel Topics.docx
@@ -149,6 +149,22 @@
     <w:p>
       <w:r>
         <w:t>Cardinality and Filter Direction</w:t>
+      </w:r>
+    </w:p>
+    <w:p>
+      <w:r>
+        <w:t>Hierarchy in Pivot Table</w:t>
+      </w:r>
+    </w:p>
+    <w:p>
+      <w:r>
+        <w:lastRenderedPageBreak/>
+        <w:t>Pivot Tables</w:t>
+      </w:r>
+    </w:p>
+    <w:p>
+      <w:r>
+        <w:t>Pivot Charts</w:t>
       </w:r>
     </w:p>
     <w:sectPr>

</xml_diff>

<commit_message>
Recorded Macros in Excel
</commit_message>
<xml_diff>
--- a/05_MS_Excel/MS Excel Notes/Excel Topics.docx
+++ b/05_MS_Excel/MS Excel Notes/Excel Topics.docx
@@ -11,8 +11,12 @@
       </w:r>
       <w:r>
         <w:br/>
+      </w:r>
+      <w:proofErr w:type="spellStart"/>
+      <w:r>
         <w:t>Flashfill</w:t>
       </w:r>
+      <w:proofErr w:type="spellEnd"/>
     </w:p>
     <w:p>
       <w:r>
@@ -70,8 +74,13 @@
     </w:p>
     <w:p>
       <w:r>
-        <w:t>Trimming WhiteSpace</w:t>
-      </w:r>
+        <w:t xml:space="preserve">Trimming </w:t>
+      </w:r>
+      <w:proofErr w:type="spellStart"/>
+      <w:r>
+        <w:t>WhiteSpace</w:t>
+      </w:r>
+      <w:proofErr w:type="spellEnd"/>
     </w:p>
     <w:p>
       <w:r>
@@ -84,8 +93,18 @@
       </w:r>
     </w:p>
     <w:p>
-      <w:r>
-        <w:t>If,AND,OR Functions</w:t>
+      <w:proofErr w:type="spellStart"/>
+      <w:proofErr w:type="gramStart"/>
+      <w:r>
+        <w:t>If,AND</w:t>
+      </w:r>
+      <w:proofErr w:type="gramEnd"/>
+      <w:r>
+        <w:t>,OR</w:t>
+      </w:r>
+      <w:proofErr w:type="spellEnd"/>
+      <w:r>
+        <w:t xml:space="preserve"> Functions</w:t>
       </w:r>
     </w:p>
     <w:p>
@@ -94,9 +113,35 @@
       </w:r>
     </w:p>
     <w:p>
-      <w:r>
-        <w:t>Countif, Countifs, Sumif, Sumifs</w:t>
-      </w:r>
+      <w:proofErr w:type="spellStart"/>
+      <w:r>
+        <w:t>Countif</w:t>
+      </w:r>
+      <w:proofErr w:type="spellEnd"/>
+      <w:r>
+        <w:t xml:space="preserve">, </w:t>
+      </w:r>
+      <w:proofErr w:type="spellStart"/>
+      <w:r>
+        <w:t>Countifs</w:t>
+      </w:r>
+      <w:proofErr w:type="spellEnd"/>
+      <w:r>
+        <w:t xml:space="preserve">, </w:t>
+      </w:r>
+      <w:proofErr w:type="spellStart"/>
+      <w:r>
+        <w:t>Sumif</w:t>
+      </w:r>
+      <w:proofErr w:type="spellEnd"/>
+      <w:r>
+        <w:t xml:space="preserve">, </w:t>
+      </w:r>
+      <w:proofErr w:type="spellStart"/>
+      <w:r>
+        <w:t>Sumifs</w:t>
+      </w:r>
+      <w:proofErr w:type="spellEnd"/>
     </w:p>
     <w:p>
       <w:r>
@@ -138,8 +183,13 @@
     </w:p>
     <w:p>
       <w:r>
-        <w:t>Data Modeling</w:t>
-      </w:r>
+        <w:t xml:space="preserve">Data </w:t>
+      </w:r>
+      <w:proofErr w:type="spellStart"/>
+      <w:r>
+        <w:t>Modeling</w:t>
+      </w:r>
+      <w:proofErr w:type="spellEnd"/>
     </w:p>
     <w:p>
       <w:r>
@@ -164,7 +214,22 @@
     </w:p>
     <w:p>
       <w:r>
-        <w:t>Pivot Charts</w:t>
+        <w:t>Visualizing Data</w:t>
+      </w:r>
+    </w:p>
+    <w:p>
+      <w:r>
+        <w:t>Slicer in MS Excel</w:t>
+      </w:r>
+    </w:p>
+    <w:p>
+      <w:r>
+        <w:t>Creating Buttons in Excel</w:t>
+      </w:r>
+    </w:p>
+    <w:p>
+      <w:r>
+        <w:t>Recorded Macros</w:t>
       </w:r>
     </w:p>
     <w:sectPr>

</xml_diff>